<commit_message>
feat: last part completed
</commit_message>
<xml_diff>
--- a/HW3/report.docx
+++ b/HW3/report.docx
@@ -26,22 +26,7 @@
       </w:r>
       <w:r>
         <w:tab/>
-      </w:r>
-      <w:proofErr w:type="spellStart"/>
-      <w:r>
-        <w:t>Razie</w:t>
-      </w:r>
-      <w:proofErr w:type="spellEnd"/>
-      <w:r>
-        <w:t xml:space="preserve"> </w:t>
-      </w:r>
-      <w:proofErr w:type="spellStart"/>
-      <w:r>
-        <w:t>Doregard</w:t>
-      </w:r>
-      <w:proofErr w:type="spellEnd"/>
-      <w:r>
-        <w:t xml:space="preserve"> – 40435056</w:t>
+        <w:t>Razie Doregard – 40435056</w:t>
       </w:r>
     </w:p>
     <w:p>
@@ -65,6 +50,9 @@
     </w:p>
     <w:p>
       <w:r>
+        <w:rPr>
+          <w:noProof/>
+        </w:rPr>
         <w:drawing>
           <wp:inline distT="0" distB="0" distL="0" distR="0" wp14:anchorId="732AE9C1" wp14:editId="21F5660F">
             <wp:extent cx="5943600" cy="1260475"/>
@@ -112,6 +100,9 @@
     </w:p>
     <w:p>
       <w:r>
+        <w:rPr>
+          <w:noProof/>
+        </w:rPr>
         <w:drawing>
           <wp:inline distT="0" distB="0" distL="0" distR="0" wp14:anchorId="0E0B5FD6" wp14:editId="3DA822BB">
             <wp:extent cx="5943600" cy="1561465"/>
@@ -159,6 +150,9 @@
     </w:p>
     <w:p>
       <w:r>
+        <w:rPr>
+          <w:noProof/>
+        </w:rPr>
         <w:drawing>
           <wp:inline distT="0" distB="0" distL="0" distR="0" wp14:anchorId="5F4AC069" wp14:editId="10596D8C">
             <wp:extent cx="5943600" cy="3350260"/>
@@ -214,15 +208,7 @@
         </w:numPr>
       </w:pPr>
       <w:r>
-        <w:t xml:space="preserve">Raw data: the </w:t>
-      </w:r>
-      <w:proofErr w:type="spellStart"/>
-      <w:r>
-        <w:t>df</w:t>
-      </w:r>
-      <w:proofErr w:type="spellEnd"/>
-      <w:r>
-        <w:t xml:space="preserve"> we already have</w:t>
+        <w:t>Raw data: the df we already have</w:t>
       </w:r>
     </w:p>
     <w:p>
@@ -240,6 +226,9 @@
         <w:br/>
       </w:r>
       <w:r>
+        <w:rPr>
+          <w:noProof/>
+        </w:rPr>
         <w:drawing>
           <wp:inline distT="0" distB="0" distL="0" distR="0" wp14:anchorId="058068B1" wp14:editId="32556E73">
             <wp:extent cx="5943600" cy="3345815"/>
@@ -282,6 +271,9 @@
         <w:pStyle w:val="ListParagraph"/>
       </w:pPr>
       <w:r>
+        <w:rPr>
+          <w:noProof/>
+        </w:rPr>
         <w:drawing>
           <wp:inline distT="0" distB="0" distL="0" distR="0" wp14:anchorId="366AAEDD" wp14:editId="25050FE8">
             <wp:extent cx="5943600" cy="2651760"/>
@@ -366,6 +358,9 @@
         <w:ind w:left="720"/>
       </w:pPr>
       <w:r>
+        <w:rPr>
+          <w:noProof/>
+        </w:rPr>
         <w:drawing>
           <wp:inline distT="0" distB="0" distL="0" distR="0" wp14:anchorId="044000C0" wp14:editId="27644ACD">
             <wp:extent cx="5943600" cy="3241675"/>
@@ -408,6 +403,9 @@
         <w:ind w:left="720"/>
       </w:pPr>
       <w:r>
+        <w:rPr>
+          <w:noProof/>
+        </w:rPr>
         <w:drawing>
           <wp:inline distT="0" distB="0" distL="0" distR="0" wp14:anchorId="17E771C8" wp14:editId="50D135A6">
             <wp:extent cx="5943600" cy="3791585"/>
@@ -484,6 +482,9 @@
         <w:t xml:space="preserve"> </w:t>
       </w:r>
       <w:r>
+        <w:rPr>
+          <w:noProof/>
+        </w:rPr>
         <w:drawing>
           <wp:inline distT="0" distB="0" distL="0" distR="0" wp14:anchorId="38F53B2F" wp14:editId="1CD989FE">
             <wp:extent cx="5943600" cy="3769360"/>
@@ -619,13 +620,8 @@
           <w:tab w:val="num" w:pos="720"/>
         </w:tabs>
       </w:pPr>
-      <w:proofErr w:type="spellStart"/>
-      <w:r>
-        <w:t>nonflavanoid_phenols</w:t>
-      </w:r>
-      <w:proofErr w:type="spellEnd"/>
-      <w:r>
-        <w:t xml:space="preserve"> → mean ≈ </w:t>
+      <w:r>
+        <w:t xml:space="preserve">nonflavanoid_phenols → mean ≈ </w:t>
       </w:r>
       <w:r>
         <w:rPr>
@@ -803,13 +799,8 @@
           <w:tab w:val="num" w:pos="720"/>
         </w:tabs>
       </w:pPr>
-      <w:proofErr w:type="spellStart"/>
-      <w:r>
-        <w:t>color_intensity</w:t>
-      </w:r>
-      <w:proofErr w:type="spellEnd"/>
-      <w:r>
-        <w:t xml:space="preserve"> → </w:t>
+      <w:r>
+        <w:t xml:space="preserve">color_intensity → </w:t>
       </w:r>
       <w:r>
         <w:rPr>
@@ -829,13 +820,8 @@
           <w:tab w:val="num" w:pos="720"/>
         </w:tabs>
       </w:pPr>
-      <w:proofErr w:type="spellStart"/>
-      <w:r>
-        <w:t>flavanoids</w:t>
-      </w:r>
-      <w:proofErr w:type="spellEnd"/>
-      <w:r>
-        <w:t xml:space="preserve"> → </w:t>
+      <w:r>
+        <w:t xml:space="preserve">flavanoids → </w:t>
       </w:r>
       <w:r>
         <w:rPr>
@@ -945,13 +931,8 @@
         </w:tabs>
         <w:ind w:left="1080"/>
       </w:pPr>
-      <w:proofErr w:type="spellStart"/>
-      <w:r>
-        <w:t>color_intensity</w:t>
-      </w:r>
-      <w:proofErr w:type="spellEnd"/>
-      <w:r>
-        <w:t>:</w:t>
+      <w:r>
+        <w:t>color_intensity:</w:t>
       </w:r>
       <w:r>
         <w:t xml:space="preserve"> </w:t>
@@ -988,13 +969,8 @@
         </w:tabs>
         <w:ind w:left="1080"/>
       </w:pPr>
-      <w:proofErr w:type="spellStart"/>
-      <w:r>
-        <w:t>flavanoids</w:t>
-      </w:r>
-      <w:proofErr w:type="spellEnd"/>
-      <w:r>
-        <w:t>:</w:t>
+      <w:r>
+        <w:t>flavanoids:</w:t>
       </w:r>
       <w:r>
         <w:t xml:space="preserve"> </w:t>
@@ -1034,14 +1010,14 @@
     </w:p>
     <w:p>
       <w:r>
-        <w:t xml:space="preserve">b. </w:t>
-      </w:r>
-      <w:r>
-        <w:t>Plot histograms for at least five selected features</w:t>
-      </w:r>
-    </w:p>
-    <w:p>
-      <w:r>
+        <w:t>b. Plot histograms for at least five selected features</w:t>
+      </w:r>
+    </w:p>
+    <w:p>
+      <w:r>
+        <w:rPr>
+          <w:noProof/>
+        </w:rPr>
         <w:drawing>
           <wp:inline distT="0" distB="0" distL="0" distR="0" wp14:anchorId="05B435A4" wp14:editId="29E58AEE">
             <wp:extent cx="5943600" cy="2965450"/>
@@ -1081,6 +1057,9 @@
     </w:p>
     <w:p>
       <w:r>
+        <w:rPr>
+          <w:noProof/>
+        </w:rPr>
         <w:lastRenderedPageBreak/>
         <w:drawing>
           <wp:inline distT="0" distB="0" distL="0" distR="0" wp14:anchorId="735E2085" wp14:editId="338B4D6C">
@@ -1135,14 +1114,12 @@
       <w:r>
         <w:t xml:space="preserve">and </w:t>
       </w:r>
-      <w:proofErr w:type="spellStart"/>
       <w:r>
         <w:rPr>
           <w:color w:val="0070C0"/>
         </w:rPr>
         <w:t>color_intensity</w:t>
       </w:r>
-      <w:proofErr w:type="spellEnd"/>
       <w:r>
         <w:t xml:space="preserve">, and </w:t>
       </w:r>
@@ -1155,14 +1132,12 @@
       <w:r>
         <w:t xml:space="preserve">are both right-skewed; The one that are almost normal is the </w:t>
       </w:r>
-      <w:proofErr w:type="spellStart"/>
       <w:r>
         <w:rPr>
           <w:color w:val="0070C0"/>
         </w:rPr>
         <w:t>alcanity_of_ash</w:t>
       </w:r>
-      <w:proofErr w:type="spellEnd"/>
       <w:r>
         <w:t>.</w:t>
       </w:r>
@@ -1232,15 +1207,7 @@
         </w:numPr>
       </w:pPr>
       <w:r>
-        <w:t>+</w:t>
-      </w:r>
-      <w:proofErr w:type="gramStart"/>
-      <w:r>
-        <w:t>1  →</w:t>
-      </w:r>
-      <w:proofErr w:type="gramEnd"/>
-      <w:r>
-        <w:t xml:space="preserve"> strong positive relation</w:t>
+        <w:t>+1  → strong positive relation</w:t>
       </w:r>
     </w:p>
     <w:p>
@@ -1281,6 +1248,9 @@
         <w:ind w:left="360"/>
       </w:pPr>
       <w:r>
+        <w:rPr>
+          <w:noProof/>
+        </w:rPr>
         <w:lastRenderedPageBreak/>
         <w:drawing>
           <wp:inline distT="0" distB="0" distL="0" distR="0" wp14:anchorId="573A3673" wp14:editId="3761A2BE">
@@ -1326,19 +1296,11 @@
       <w:r>
         <w:t xml:space="preserve">After sorting the values of the heatmap, the highest correlation is a positive correlation between the pairs: </w:t>
       </w:r>
-      <w:proofErr w:type="spellStart"/>
       <w:r>
         <w:rPr>
           <w:color w:val="0070C0"/>
         </w:rPr>
-        <w:t>total_phenols</w:t>
-      </w:r>
-      <w:proofErr w:type="spellEnd"/>
-      <w:r>
-        <w:rPr>
-          <w:color w:val="0070C0"/>
-        </w:rPr>
-        <w:t>, flavonoids</w:t>
+        <w:t>total_phenols, flavonoids</w:t>
       </w:r>
       <w:r>
         <w:t xml:space="preserve"> and </w:t>
@@ -1475,6 +1437,9 @@
     </w:p>
     <w:p>
       <w:r>
+        <w:rPr>
+          <w:noProof/>
+        </w:rPr>
         <w:drawing>
           <wp:inline distT="0" distB="0" distL="0" distR="0" wp14:anchorId="7AA1A361" wp14:editId="01E6CD33">
             <wp:extent cx="5943600" cy="2252980"/>
@@ -1596,7 +1561,7 @@
           <w:noProof/>
         </w:rPr>
         <w:drawing>
-          <wp:inline distT="0" distB="0" distL="0" distR="0" wp14:anchorId="67DE73FA" wp14:editId="74DB6536">
+          <wp:inline distT="0" distB="0" distL="0" distR="0" wp14:anchorId="67DE73FA" wp14:editId="5A7FA49D">
             <wp:extent cx="2901043" cy="2231880"/>
             <wp:effectExtent l="0" t="0" r="0" b="0"/>
             <wp:docPr id="1973291723" name="Picture 6"/>
@@ -1645,7 +1610,7 @@
           <w:noProof/>
         </w:rPr>
         <w:drawing>
-          <wp:inline distT="0" distB="0" distL="0" distR="0" wp14:anchorId="1B999233" wp14:editId="6FA3AAC6">
+          <wp:inline distT="0" distB="0" distL="0" distR="0" wp14:anchorId="1B999233" wp14:editId="1E5FC119">
             <wp:extent cx="2901043" cy="2231883"/>
             <wp:effectExtent l="0" t="0" r="0" b="0"/>
             <wp:docPr id="701318646" name="Picture 7"/>
@@ -1699,6 +1664,9 @@
     </w:p>
     <w:p>
       <w:r>
+        <w:rPr>
+          <w:noProof/>
+        </w:rPr>
         <w:drawing>
           <wp:inline distT="0" distB="0" distL="0" distR="0" wp14:anchorId="38832269" wp14:editId="6A335228">
             <wp:extent cx="5943600" cy="2266315"/>
@@ -1738,6 +1706,9 @@
     </w:p>
     <w:p>
       <w:r>
+        <w:rPr>
+          <w:noProof/>
+        </w:rPr>
         <w:drawing>
           <wp:inline distT="0" distB="0" distL="0" distR="0" wp14:anchorId="08900D3A" wp14:editId="64063B25">
             <wp:extent cx="5943600" cy="2329815"/>
@@ -1822,6 +1793,9 @@
     </w:p>
     <w:p>
       <w:r>
+        <w:rPr>
+          <w:noProof/>
+        </w:rPr>
         <w:drawing>
           <wp:inline distT="0" distB="0" distL="0" distR="0" wp14:anchorId="7797E20C" wp14:editId="3621E2E4">
             <wp:extent cx="5943600" cy="3380740"/>
@@ -1945,15 +1919,7 @@
         <w:t>inertia always decreases if you increase the number of clusters</w:t>
       </w:r>
       <w:r>
-        <w:t xml:space="preserve">, even if the new clusters aren’t meaningful. </w:t>
-      </w:r>
-      <w:proofErr w:type="gramStart"/>
-      <w:r>
-        <w:t>So</w:t>
-      </w:r>
-      <w:proofErr w:type="gramEnd"/>
-      <w:r>
-        <w:t xml:space="preserve"> it’s not enough by itself to pick</w:t>
+        <w:t>, even if the new clusters aren’t meaningful. So it’s not enough by itself to pick</w:t>
       </w:r>
       <w:r>
         <w:t xml:space="preserve"> k</w:t>
@@ -2084,6 +2050,9 @@
         <w:ind w:left="720"/>
       </w:pPr>
       <w:r>
+        <w:rPr>
+          <w:noProof/>
+        </w:rPr>
         <w:lastRenderedPageBreak/>
         <w:drawing>
           <wp:inline distT="0" distB="0" distL="0" distR="0" wp14:anchorId="61475D2F" wp14:editId="6D9254C2">
@@ -2125,6 +2094,9 @@
         <w:t xml:space="preserve">                </w:t>
       </w:r>
       <w:r>
+        <w:rPr>
+          <w:noProof/>
+        </w:rPr>
         <w:drawing>
           <wp:inline distT="0" distB="0" distL="0" distR="0" wp14:anchorId="37372142" wp14:editId="32569AFE">
             <wp:extent cx="2253342" cy="846710"/>
@@ -3355,15 +3327,7 @@
         <w:t>k = 3</w:t>
       </w:r>
       <w:r>
-        <w:t>, K-Means clustering was applied to the dataset under three preprocessing conditions: raw, Z-score normalized, and Min-Max scaled. Across all datasets, both the custom implementation and scikit-</w:t>
-      </w:r>
-      <w:proofErr w:type="spellStart"/>
-      <w:r>
-        <w:t>learn’s</w:t>
-      </w:r>
-      <w:proofErr w:type="spellEnd"/>
-      <w:r>
-        <w:t xml:space="preserve"> K-Means converged to nearly identical inertia values, indicating consistent clustering solutions. The number of iterations required for convergence varied slightly, with scikit-learn generally requiring fewer iterations due to optimized initialization, while runtime differences were minor and dataset-dependent. Notably, the inertia decreases substantially after normalization, reflecting the effect of scaling on the magnitude of within-cluster variance, but the relative clustering structure remains consistent across implementations.</w:t>
+        <w:t>, K-Means clustering was applied to the dataset under three preprocessing conditions: raw, Z-score normalized, and Min-Max scaled. Across all datasets, both the custom implementation and scikit-learn’s K-Means converged to nearly identical inertia values, indicating consistent clustering solutions. The number of iterations required for convergence varied slightly, with scikit-learn generally requiring fewer iterations due to optimized initialization, while runtime differences were minor and dataset-dependent. Notably, the inertia decreases substantially after normalization, reflecting the effect of scaling on the magnitude of within-cluster variance, but the relative clustering structure remains consistent across implementations.</w:t>
       </w:r>
     </w:p>
     <w:p/>
@@ -3382,13 +3346,8 @@
       </w:r>
     </w:p>
     <w:p>
-      <w:proofErr w:type="spellStart"/>
-      <w:r>
-        <w:t>Cophentic</w:t>
-      </w:r>
-      <w:proofErr w:type="spellEnd"/>
-      <w:r>
-        <w:t>:</w:t>
+      <w:r>
+        <w:t>Cophentic:</w:t>
       </w:r>
     </w:p>
     <w:p>
@@ -3446,10 +3405,7 @@
         </w:numPr>
       </w:pPr>
       <w:r>
-        <w:t xml:space="preserve">~1: </w:t>
-      </w:r>
-      <w:r>
-        <w:t>Dendrogram faithfully preserves original distances → good clustering representation</w:t>
+        <w:t>~1: Dendrogram faithfully preserves original distances → good clustering representation</w:t>
       </w:r>
     </w:p>
     <w:p>
@@ -3461,10 +3417,7 @@
         </w:numPr>
       </w:pPr>
       <w:r>
-        <w:t xml:space="preserve">~0: </w:t>
-      </w:r>
-      <w:r>
-        <w:t>Dendrogram does not preserve distances well → clustering may not reflect true structure</w:t>
+        <w:t>~0: Dendrogram does not preserve distances well → clustering may not reflect true structure</w:t>
       </w:r>
     </w:p>
     <w:tbl>
@@ -3790,21 +3743,7 @@
         <w:rPr>
           <w:color w:val="0070C0"/>
         </w:rPr>
-        <w:t xml:space="preserve">highest </w:t>
-      </w:r>
-      <w:proofErr w:type="spellStart"/>
-      <w:r>
-        <w:rPr>
-          <w:color w:val="0070C0"/>
-        </w:rPr>
-        <w:t>cophentic</w:t>
-      </w:r>
-      <w:proofErr w:type="spellEnd"/>
-      <w:r>
-        <w:rPr>
-          <w:color w:val="0070C0"/>
-        </w:rPr>
-        <w:t xml:space="preserve"> </w:t>
+        <w:t xml:space="preserve">highest cophentic </w:t>
       </w:r>
       <w:r>
         <w:t>correlation, meaning the cluster distances on the tree is higher than the other methods, meaning the clustering is working quite well!</w:t>
@@ -3904,21 +3843,12 @@
           <w:numId w:val="18"/>
         </w:numPr>
       </w:pPr>
-      <w:proofErr w:type="spellStart"/>
       <w:r>
         <w:rPr>
           <w:b/>
           <w:bCs/>
         </w:rPr>
-        <w:t>MinPts</w:t>
-      </w:r>
-      <w:proofErr w:type="spellEnd"/>
-      <w:r>
-        <w:rPr>
-          <w:b/>
-          <w:bCs/>
-        </w:rPr>
-        <w:t>:</w:t>
+        <w:t>MinPts:</w:t>
       </w:r>
       <w:r>
         <w:t xml:space="preserve"> minimum number of points required within ε to form a dense region</w:t>
@@ -3939,15 +3869,7 @@
         <w:t>Core points:</w:t>
       </w:r>
       <w:r>
-        <w:t xml:space="preserve"> points with ≥ </w:t>
-      </w:r>
-      <w:proofErr w:type="spellStart"/>
-      <w:r>
-        <w:t>MinPts</w:t>
-      </w:r>
-      <w:proofErr w:type="spellEnd"/>
-      <w:r>
-        <w:t xml:space="preserve"> neighbors in ε-radius</w:t>
+        <w:t xml:space="preserve"> points with ≥ MinPts neighbors in ε-radius</w:t>
       </w:r>
     </w:p>
     <w:p>
@@ -3965,15 +3887,7 @@
         <w:t>Border points:</w:t>
       </w:r>
       <w:r>
-        <w:t xml:space="preserve"> points in ε-radius of a core point but with &lt; </w:t>
-      </w:r>
-      <w:proofErr w:type="spellStart"/>
-      <w:r>
-        <w:t>MinPts</w:t>
-      </w:r>
-      <w:proofErr w:type="spellEnd"/>
-      <w:r>
-        <w:t xml:space="preserve"> neighbors</w:t>
+        <w:t xml:space="preserve"> points in ε-radius of a core point but with &lt; MinPts neighbors</w:t>
       </w:r>
     </w:p>
     <w:p>
@@ -3999,6 +3913,9 @@
         <w:ind w:left="360"/>
       </w:pPr>
       <w:r>
+        <w:rPr>
+          <w:noProof/>
+        </w:rPr>
         <w:lastRenderedPageBreak/>
         <w:drawing>
           <wp:inline distT="0" distB="0" distL="0" distR="0" wp14:anchorId="234BC326" wp14:editId="28A3FA05">
@@ -4271,7 +4188,487 @@
         <w:t xml:space="preserve"> Part 6: Fully Automated Clustering System</w:t>
       </w:r>
     </w:p>
+    <w:p>
+      <w:r>
+        <w:t>Result on standardized data:</w:t>
+      </w:r>
+    </w:p>
+    <w:p>
+      <w:r>
+        <w:t>{'Best Algorithm': 'DBSCAN', 'Hyperparameters': {'eps': np.float64(0.5), 'min_samples': 7}, 'Silhouette Score': 0.6502464641416931, 'Number of Clusters': 5, 'Number of Noise Points': np.int64(55)}</w:t>
+      </w:r>
+    </w:p>
+    <w:p>
+      <w:r>
+        <w:t>Result after applying PCA manually:</w:t>
+      </w:r>
+    </w:p>
+    <w:p>
+      <w:r>
+        <w:t>{'Best Algorithm': 'KMeans', 'Hyperparameters': {'n_clusters': 3, 'random_state': 42}, 'Silhouette Score': 0.5999742419909309, 'Number of Clusters': 3, 'Number of Noise Points': 0}</w:t>
+      </w:r>
+    </w:p>
+    <w:p>
+      <w:r>
+        <w:t>I added this evaluation function:</w:t>
+      </w:r>
+    </w:p>
+    <w:p>
+      <w:r>
+        <w:drawing>
+          <wp:inline distT="0" distB="0" distL="0" distR="0" wp14:anchorId="74253708" wp14:editId="4BF16B19">
+            <wp:extent cx="5943600" cy="1990725"/>
+            <wp:effectExtent l="0" t="0" r="0" b="9525"/>
+            <wp:docPr id="1977703615" name="Picture 1"/>
+            <wp:cNvGraphicFramePr>
+              <a:graphicFrameLocks xmlns:a="http://schemas.openxmlformats.org/drawingml/2006/main" noChangeAspect="1"/>
+            </wp:cNvGraphicFramePr>
+            <a:graphic xmlns:a="http://schemas.openxmlformats.org/drawingml/2006/main">
+              <a:graphicData uri="http://schemas.openxmlformats.org/drawingml/2006/picture">
+                <pic:pic xmlns:pic="http://schemas.openxmlformats.org/drawingml/2006/picture">
+                  <pic:nvPicPr>
+                    <pic:cNvPr id="1977703615" name=""/>
+                    <pic:cNvPicPr/>
+                  </pic:nvPicPr>
+                  <pic:blipFill>
+                    <a:blip r:embed="rId27"/>
+                    <a:stretch>
+                      <a:fillRect/>
+                    </a:stretch>
+                  </pic:blipFill>
+                  <pic:spPr>
+                    <a:xfrm>
+                      <a:off x="0" y="0"/>
+                      <a:ext cx="5943600" cy="1990725"/>
+                    </a:xfrm>
+                    <a:prstGeom prst="rect">
+                      <a:avLst/>
+                    </a:prstGeom>
+                  </pic:spPr>
+                </pic:pic>
+              </a:graphicData>
+            </a:graphic>
+          </wp:inline>
+        </w:drawing>
+      </w:r>
+    </w:p>
+    <w:p>
+      <w:r>
+        <w:t>It checks whether the clustering results are meaningful, if they’re not, it applies PCA to reduce dimensionality and improve the clustering results.</w:t>
+      </w:r>
+    </w:p>
     <w:p/>
+    <w:p/>
+    <w:p/>
+    <w:p/>
+    <w:p/>
+    <w:p/>
+    <w:p/>
+    <w:p/>
+    <w:p/>
+    <w:p>
+      <w:r>
+        <w:lastRenderedPageBreak/>
+        <w:t>12.1</w:t>
+      </w:r>
+      <w:r>
+        <w:t>.</w:t>
+      </w:r>
+      <w:r>
+        <w:t xml:space="preserve"> Bonus 1: Subspace Clustering via PCA</w:t>
+      </w:r>
+    </w:p>
+    <w:tbl>
+      <w:tblPr>
+        <w:tblW w:w="4444" w:type="dxa"/>
+        <w:tblCellSpacing w:w="15" w:type="dxa"/>
+        <w:tblCellMar>
+          <w:top w:w="15" w:type="dxa"/>
+          <w:left w:w="15" w:type="dxa"/>
+          <w:bottom w:w="15" w:type="dxa"/>
+          <w:right w:w="15" w:type="dxa"/>
+        </w:tblCellMar>
+        <w:tblLook w:val="04A0" w:firstRow="1" w:lastRow="0" w:firstColumn="1" w:lastColumn="0" w:noHBand="0" w:noVBand="1"/>
+      </w:tblPr>
+      <w:tblGrid>
+        <w:gridCol w:w="2226"/>
+        <w:gridCol w:w="2218"/>
+      </w:tblGrid>
+      <w:tr>
+        <w:trPr>
+          <w:trHeight w:val="501"/>
+          <w:tblHeader/>
+          <w:tblCellSpacing w:w="15" w:type="dxa"/>
+        </w:trPr>
+        <w:tc>
+          <w:tcPr>
+            <w:tcW w:w="0" w:type="auto"/>
+            <w:vAlign w:val="center"/>
+            <w:hideMark/>
+          </w:tcPr>
+          <w:p>
+            <w:pPr>
+              <w:rPr>
+                <w:b/>
+                <w:bCs/>
+              </w:rPr>
+            </w:pPr>
+            <w:r>
+              <w:rPr>
+                <w:b/>
+                <w:bCs/>
+              </w:rPr>
+              <w:t>PCA Dimensions</w:t>
+            </w:r>
+          </w:p>
+        </w:tc>
+        <w:tc>
+          <w:tcPr>
+            <w:tcW w:w="0" w:type="auto"/>
+            <w:vAlign w:val="center"/>
+            <w:hideMark/>
+          </w:tcPr>
+          <w:p>
+            <w:pPr>
+              <w:rPr>
+                <w:b/>
+                <w:bCs/>
+              </w:rPr>
+            </w:pPr>
+            <w:r>
+              <w:rPr>
+                <w:b/>
+                <w:bCs/>
+              </w:rPr>
+              <w:t>Silhouette Score</w:t>
+            </w:r>
+          </w:p>
+        </w:tc>
+      </w:tr>
+      <w:tr>
+        <w:trPr>
+          <w:trHeight w:val="493"/>
+          <w:tblCellSpacing w:w="15" w:type="dxa"/>
+        </w:trPr>
+        <w:tc>
+          <w:tcPr>
+            <w:tcW w:w="0" w:type="auto"/>
+            <w:vAlign w:val="center"/>
+            <w:hideMark/>
+          </w:tcPr>
+          <w:p>
+            <w:r>
+              <w:t>2</w:t>
+            </w:r>
+          </w:p>
+        </w:tc>
+        <w:tc>
+          <w:tcPr>
+            <w:tcW w:w="0" w:type="auto"/>
+            <w:vAlign w:val="center"/>
+            <w:hideMark/>
+          </w:tcPr>
+          <w:p>
+            <w:r>
+              <w:t>0.561</w:t>
+            </w:r>
+          </w:p>
+        </w:tc>
+      </w:tr>
+      <w:tr>
+        <w:trPr>
+          <w:trHeight w:val="501"/>
+          <w:tblCellSpacing w:w="15" w:type="dxa"/>
+        </w:trPr>
+        <w:tc>
+          <w:tcPr>
+            <w:tcW w:w="0" w:type="auto"/>
+            <w:vAlign w:val="center"/>
+            <w:hideMark/>
+          </w:tcPr>
+          <w:p>
+            <w:r>
+              <w:t>3</w:t>
+            </w:r>
+          </w:p>
+        </w:tc>
+        <w:tc>
+          <w:tcPr>
+            <w:tcW w:w="0" w:type="auto"/>
+            <w:vAlign w:val="center"/>
+            <w:hideMark/>
+          </w:tcPr>
+          <w:p>
+            <w:r>
+              <w:t>0.453</w:t>
+            </w:r>
+          </w:p>
+        </w:tc>
+      </w:tr>
+      <w:tr>
+        <w:trPr>
+          <w:trHeight w:val="493"/>
+          <w:tblCellSpacing w:w="15" w:type="dxa"/>
+        </w:trPr>
+        <w:tc>
+          <w:tcPr>
+            <w:tcW w:w="0" w:type="auto"/>
+            <w:vAlign w:val="center"/>
+            <w:hideMark/>
+          </w:tcPr>
+          <w:p>
+            <w:r>
+              <w:t>4</w:t>
+            </w:r>
+          </w:p>
+        </w:tc>
+        <w:tc>
+          <w:tcPr>
+            <w:tcW w:w="0" w:type="auto"/>
+            <w:vAlign w:val="center"/>
+            <w:hideMark/>
+          </w:tcPr>
+          <w:p>
+            <w:r>
+              <w:t>0.407</w:t>
+            </w:r>
+          </w:p>
+        </w:tc>
+      </w:tr>
+      <w:tr>
+        <w:trPr>
+          <w:trHeight w:val="493"/>
+          <w:tblCellSpacing w:w="15" w:type="dxa"/>
+        </w:trPr>
+        <w:tc>
+          <w:tcPr>
+            <w:tcW w:w="0" w:type="auto"/>
+            <w:vAlign w:val="center"/>
+            <w:hideMark/>
+          </w:tcPr>
+          <w:p>
+            <w:r>
+              <w:t>5</w:t>
+            </w:r>
+          </w:p>
+        </w:tc>
+        <w:tc>
+          <w:tcPr>
+            <w:tcW w:w="0" w:type="auto"/>
+            <w:vAlign w:val="center"/>
+            <w:hideMark/>
+          </w:tcPr>
+          <w:p>
+            <w:r>
+              <w:t>0.369</w:t>
+            </w:r>
+          </w:p>
+        </w:tc>
+      </w:tr>
+      <w:tr>
+        <w:trPr>
+          <w:trHeight w:val="493"/>
+          <w:tblCellSpacing w:w="15" w:type="dxa"/>
+        </w:trPr>
+        <w:tc>
+          <w:tcPr>
+            <w:tcW w:w="0" w:type="auto"/>
+            <w:vAlign w:val="center"/>
+            <w:hideMark/>
+          </w:tcPr>
+          <w:p>
+            <w:r>
+              <w:t>6</w:t>
+            </w:r>
+          </w:p>
+        </w:tc>
+        <w:tc>
+          <w:tcPr>
+            <w:tcW w:w="0" w:type="auto"/>
+            <w:vAlign w:val="center"/>
+            <w:hideMark/>
+          </w:tcPr>
+          <w:p>
+            <w:r>
+              <w:t>0.346</w:t>
+            </w:r>
+          </w:p>
+        </w:tc>
+      </w:tr>
+      <w:tr>
+        <w:trPr>
+          <w:trHeight w:val="501"/>
+          <w:tblCellSpacing w:w="15" w:type="dxa"/>
+        </w:trPr>
+        <w:tc>
+          <w:tcPr>
+            <w:tcW w:w="0" w:type="auto"/>
+            <w:vAlign w:val="center"/>
+            <w:hideMark/>
+          </w:tcPr>
+          <w:p>
+            <w:r>
+              <w:t>7</w:t>
+            </w:r>
+          </w:p>
+        </w:tc>
+        <w:tc>
+          <w:tcPr>
+            <w:tcW w:w="0" w:type="auto"/>
+            <w:vAlign w:val="center"/>
+            <w:hideMark/>
+          </w:tcPr>
+          <w:p>
+            <w:r>
+              <w:t>0.328</w:t>
+            </w:r>
+          </w:p>
+        </w:tc>
+      </w:tr>
+      <w:tr>
+        <w:trPr>
+          <w:trHeight w:val="493"/>
+          <w:tblCellSpacing w:w="15" w:type="dxa"/>
+        </w:trPr>
+        <w:tc>
+          <w:tcPr>
+            <w:tcW w:w="0" w:type="auto"/>
+            <w:vAlign w:val="center"/>
+            <w:hideMark/>
+          </w:tcPr>
+          <w:p>
+            <w:r>
+              <w:t>8</w:t>
+            </w:r>
+          </w:p>
+        </w:tc>
+        <w:tc>
+          <w:tcPr>
+            <w:tcW w:w="0" w:type="auto"/>
+            <w:vAlign w:val="center"/>
+            <w:hideMark/>
+          </w:tcPr>
+          <w:p>
+            <w:r>
+              <w:t>0.315</w:t>
+            </w:r>
+          </w:p>
+        </w:tc>
+      </w:tr>
+      <w:tr>
+        <w:trPr>
+          <w:trHeight w:val="493"/>
+          <w:tblCellSpacing w:w="15" w:type="dxa"/>
+        </w:trPr>
+        <w:tc>
+          <w:tcPr>
+            <w:tcW w:w="0" w:type="auto"/>
+            <w:vAlign w:val="center"/>
+            <w:hideMark/>
+          </w:tcPr>
+          <w:p>
+            <w:r>
+              <w:t>9</w:t>
+            </w:r>
+          </w:p>
+        </w:tc>
+        <w:tc>
+          <w:tcPr>
+            <w:tcW w:w="0" w:type="auto"/>
+            <w:vAlign w:val="center"/>
+            <w:hideMark/>
+          </w:tcPr>
+          <w:p>
+            <w:r>
+              <w:t>0.306</w:t>
+            </w:r>
+          </w:p>
+        </w:tc>
+      </w:tr>
+      <w:tr>
+        <w:trPr>
+          <w:trHeight w:val="501"/>
+          <w:tblCellSpacing w:w="15" w:type="dxa"/>
+        </w:trPr>
+        <w:tc>
+          <w:tcPr>
+            <w:tcW w:w="0" w:type="auto"/>
+            <w:vAlign w:val="center"/>
+            <w:hideMark/>
+          </w:tcPr>
+          <w:p>
+            <w:r>
+              <w:t>10</w:t>
+            </w:r>
+          </w:p>
+        </w:tc>
+        <w:tc>
+          <w:tcPr>
+            <w:tcW w:w="0" w:type="auto"/>
+            <w:vAlign w:val="center"/>
+            <w:hideMark/>
+          </w:tcPr>
+          <w:p>
+            <w:r>
+              <w:t>0.299</w:t>
+            </w:r>
+          </w:p>
+        </w:tc>
+      </w:tr>
+    </w:tbl>
+    <w:p>
+      <w:r>
+        <w:rPr>
+          <w:noProof/>
+        </w:rPr>
+        <w:drawing>
+          <wp:inline distT="0" distB="0" distL="0" distR="0" wp14:anchorId="031022F6" wp14:editId="1E421234">
+            <wp:extent cx="3510643" cy="2777987"/>
+            <wp:effectExtent l="0" t="0" r="0" b="3810"/>
+            <wp:docPr id="1870983869" name="Picture 1"/>
+            <wp:cNvGraphicFramePr>
+              <a:graphicFrameLocks xmlns:a="http://schemas.openxmlformats.org/drawingml/2006/main" noChangeAspect="1"/>
+            </wp:cNvGraphicFramePr>
+            <a:graphic xmlns:a="http://schemas.openxmlformats.org/drawingml/2006/main">
+              <a:graphicData uri="http://schemas.openxmlformats.org/drawingml/2006/picture">
+                <pic:pic xmlns:pic="http://schemas.openxmlformats.org/drawingml/2006/picture">
+                  <pic:nvPicPr>
+                    <pic:cNvPr id="1870983869" name="Picture 1870983869"/>
+                    <pic:cNvPicPr/>
+                  </pic:nvPicPr>
+                  <pic:blipFill>
+                    <a:blip r:embed="rId28">
+                      <a:extLst>
+                        <a:ext uri="{28A0092B-C50C-407E-A947-70E740481C1C}">
+                          <a14:useLocalDpi xmlns:a14="http://schemas.microsoft.com/office/drawing/2010/main" val="0"/>
+                        </a:ext>
+                      </a:extLst>
+                    </a:blip>
+                    <a:stretch>
+                      <a:fillRect/>
+                    </a:stretch>
+                  </pic:blipFill>
+                  <pic:spPr>
+                    <a:xfrm>
+                      <a:off x="0" y="0"/>
+                      <a:ext cx="3516488" cy="2782612"/>
+                    </a:xfrm>
+                    <a:prstGeom prst="rect">
+                      <a:avLst/>
+                    </a:prstGeom>
+                  </pic:spPr>
+                </pic:pic>
+              </a:graphicData>
+            </a:graphic>
+          </wp:inline>
+        </w:drawing>
+      </w:r>
+    </w:p>
+    <w:p>
+      <w:r>
+        <w:t>The highest score occurs when the number of components is 2.</w:t>
+      </w:r>
+    </w:p>
     <w:sectPr>
       <w:pgSz w:w="12240" w:h="15840"/>
       <w:pgMar w:top="1440" w:right="1440" w:bottom="1440" w:left="1440" w:header="708" w:footer="708" w:gutter="0"/>

</xml_diff>